<commit_message>
Remove guide name; add step-by-step run guide, .env guidance and AI key setup
Co-Authored-By: Claude Sonnet 5.5 <noreply@anthropic.com>
</commit_message>
<xml_diff>
--- a/docs/exports/02_Concept_Note.docx
+++ b/docs/exports/02_Concept_Note.docx
@@ -171,21 +171,21 @@
                 <w:bCs/>
                 <w:sz w:val="17"/>
               </w:rPr>
-              <w:t xml:space="preserve">Guide</w:t>
-            </w:r>
-          </w:p>
-        </w:tc>
-        <w:tc>
-          <w:tcPr/>
-          <w:p>
-            <w:pPr>
-              <w:pStyle w:val="Compact"/>
-            </w:pPr>
-            <w:r>
-              <w:rPr>
-                <w:sz w:val="17"/>
-              </w:rPr>
-              <w:t xml:space="preserve">Dr. Asesh Kumar Tripathy</w:t>
+              <w:t xml:space="preserve">Institution</w:t>
+            </w:r>
+          </w:p>
+        </w:tc>
+        <w:tc>
+          <w:tcPr/>
+          <w:p>
+            <w:pPr>
+              <w:pStyle w:val="Compact"/>
+            </w:pPr>
+            <w:r>
+              <w:rPr>
+                <w:sz w:val="17"/>
+              </w:rPr>
+              <w:t xml:space="preserve">KL University</w:t>
             </w:r>
           </w:p>
         </w:tc>
@@ -203,21 +203,21 @@
                 <w:bCs/>
                 <w:sz w:val="17"/>
               </w:rPr>
-              <w:t xml:space="preserve">Institution</w:t>
-            </w:r>
-          </w:p>
-        </w:tc>
-        <w:tc>
-          <w:tcPr/>
-          <w:p>
-            <w:pPr>
-              <w:pStyle w:val="Compact"/>
-            </w:pPr>
-            <w:r>
-              <w:rPr>
-                <w:sz w:val="17"/>
-              </w:rPr>
-              <w:t xml:space="preserve">KL University</w:t>
+              <w:t xml:space="preserve">Academic year</w:t>
+            </w:r>
+          </w:p>
+        </w:tc>
+        <w:tc>
+          <w:tcPr/>
+          <w:p>
+            <w:pPr>
+              <w:pStyle w:val="Compact"/>
+            </w:pPr>
+            <w:r>
+              <w:rPr>
+                <w:sz w:val="17"/>
+              </w:rPr>
+              <w:t xml:space="preserve">2026-27</w:t>
             </w:r>
           </w:p>
         </w:tc>
@@ -235,38 +235,6 @@
                 <w:bCs/>
                 <w:sz w:val="17"/>
               </w:rPr>
-              <w:t xml:space="preserve">Academic year</w:t>
-            </w:r>
-          </w:p>
-        </w:tc>
-        <w:tc>
-          <w:tcPr/>
-          <w:p>
-            <w:pPr>
-              <w:pStyle w:val="Compact"/>
-            </w:pPr>
-            <w:r>
-              <w:rPr>
-                <w:sz w:val="17"/>
-              </w:rPr>
-              <w:t xml:space="preserve">2026-27</w:t>
-            </w:r>
-          </w:p>
-        </w:tc>
-      </w:tr>
-      <w:tr>
-        <w:tc>
-          <w:tcPr/>
-          <w:p>
-            <w:pPr>
-              <w:pStyle w:val="Compact"/>
-            </w:pPr>
-            <w:r>
-              <w:rPr>
-                <w:b/>
-                <w:bCs/>
-                <w:sz w:val="17"/>
-              </w:rPr>
               <w:t xml:space="preserve">Date</w:t>
             </w:r>
           </w:p>
@@ -281,7 +249,7 @@
               <w:rPr>
                 <w:sz w:val="17"/>
               </w:rPr>
-              <w:t xml:space="preserve">24-Oct-2026 (IST)</w:t>
+              <w:t xml:space="preserve">26-Oct-2026 (IST)</w:t>
             </w:r>
           </w:p>
         </w:tc>

</xml_diff>